<commit_message>
nev motion-brief, petition-for-discretionary-review, reply-brief regenerated on the model at HEAD: tier 1 0 failed on every engine, LaTeX now matches typst line for line; still report (a docx note set a page after its call, Word's widow control on a quotation that anchors a note) (fb-595.54.18)
Co-Authored-By: Claude Opus 5.5 <noreply@anthropic.com>
</commit_message>
<xml_diff>
--- a/courts/ninth-circuit/nevada/state/supreme-court/motion-brief/usage/OUTPUT-motion-brief.docx
+++ b/courts/ninth-circuit/nevada/state/supreme-court/motion-brief/usage/OUTPUT-motion-brief.docx
@@ -1900,7 +1900,7 @@
         <w:t xml:space="preserve"> </w:t>
       </w:r>
       <w:r>
-        <w:t xml:space="preserve">“[o]n its own or a party’s motion, . . . expedite its decision or for other good cause – suspend any provision of these Rules in a particular case and order proceedings as it directs, except as otherwise provided in Rule 26(b).”</w:t>
+        <w:t xml:space="preserve">“[o]n its own or a party’s motion, . . . expedite its decision or for other good cause – suspend any provision of these Rules in a particular case and order proceedings as it directs, except as otherwise provided in Rule 26(b).”</w:t>
       </w:r>
       <w:r>
         <w:t xml:space="preserve"> </w:t>
@@ -8735,7 +8735,7 @@
         <w:t xml:space="preserve"> </w:t>
       </w:r>
       <w:r>
-        <w:t xml:space="preserve">NRS 293B.330, .335, .353, and 354.</w:t>
+        <w:t xml:space="preserve">NRS 293B.330, .335, .353, and 354.</w:t>
       </w:r>
     </w:p>
   </w:footnote>
@@ -8754,7 +8754,7 @@
         <w:t xml:space="preserve"> </w:t>
       </w:r>
       <w:r>
-        <w:t xml:space="preserve">Merriam Webster’s Online Dictionary, https://www.merriam-webster.com/​dictionary/ observe (emphasis added). This definition is also consistent with the Election Observation Handbook (6th Ed.), published by the OSCE Office for Democratic Institutions and Human Rights.</w:t>
+        <w:t xml:space="preserve">Merriam Webster’s Online Dictionary, https://​www.​merriam-​webster.​com/​​dictionary/ observe (emphasis added). This definition is also consistent with the Election Observation Handbook (6th Ed.), published by the OSCE Office for Democratic Institutions and Human Rights.</w:t>
       </w:r>
     </w:p>
   </w:footnote>
@@ -9571,6 +9571,7 @@
     <w:unhideWhenUsed/>
     <w:qFormat/>
     <w:pPr>
+      <w:keepLines/>
       <w:spacing w:before="0" w:after="140" w:line="322" w:lineRule="exact"/>
     </w:pPr>
     <w:rPr>
@@ -9821,6 +9822,33 @@
     <w:pPr>
       <w:spacing w:before="0" w:after="0" w:line="322" w:lineRule="exact"/>
       <w:ind w:left="2160" w:hanging="720"/>
+    </w:pPr>
+  </w:style>
+  <w:style w:type="paragraph" w:customStyle="1" w:styleId="XdQuoteList1">
+    <w:name w:val="Xd Quote List 1"/>
+    <w:basedOn w:val="Normal"/>
+    <w:qFormat/>
+    <w:pPr>
+      <w:spacing w:before="0" w:after="0" w:line="322" w:lineRule="exact"/>
+      <w:ind w:left="1440" w:right="720" w:hanging="720"/>
+    </w:pPr>
+  </w:style>
+  <w:style w:type="paragraph" w:customStyle="1" w:styleId="XdQuoteList2">
+    <w:name w:val="Xd Quote List 2"/>
+    <w:basedOn w:val="Normal"/>
+    <w:qFormat/>
+    <w:pPr>
+      <w:spacing w:before="0" w:after="0" w:line="322" w:lineRule="exact"/>
+      <w:ind w:left="2160" w:right="720" w:hanging="720"/>
+    </w:pPr>
+  </w:style>
+  <w:style w:type="paragraph" w:customStyle="1" w:styleId="XdQuoteList3">
+    <w:name w:val="Xd Quote List 3"/>
+    <w:basedOn w:val="Normal"/>
+    <w:qFormat/>
+    <w:pPr>
+      <w:spacing w:before="0" w:after="0" w:line="322" w:lineRule="exact"/>
+      <w:ind w:left="2880" w:right="720" w:hanging="720"/>
     </w:pPr>
   </w:style>
   <w:style w:type="paragraph" w:customStyle="1" w:styleId="SourceCode">

</xml_diff>